<commit_message>
Test Case ( Final docx)
</commit_message>
<xml_diff>
--- a/Test Case.docx
+++ b/Test Case.docx
@@ -20,7 +20,17 @@
           <w:sz w:val="36"/>
           <w:szCs w:val="36"/>
         </w:rPr>
-        <w:t>Test case: 01</w:t>
+        <w:t xml:space="preserve">Test case: </w:t>
+      </w:r>
+      <w:r>
+        <w:rPr>
+          <w:rFonts w:ascii="Times New Roman" w:hAnsi="Times New Roman" w:cs="Times New Roman"/>
+          <w:b/>
+          <w:bCs/>
+          <w:sz w:val="36"/>
+          <w:szCs w:val="36"/>
+        </w:rPr>
+        <w:t>Verify Login (01)</w:t>
       </w:r>
     </w:p>
     <w:tbl>
@@ -123,6 +133,29 @@
               </w:rPr>
               <w:t xml:space="preserve">Test Designed by: </w:t>
             </w:r>
+            <w:r>
+              <w:rPr>
+                <w:rFonts w:ascii="Times New Roman" w:eastAsia="Times New Roman" w:hAnsi="Times New Roman" w:cs="Times New Roman"/>
+                <w:b/>
+                <w:bCs/>
+                <w:color w:val="000000" w:themeColor="text1"/>
+                <w:kern w:val="24"/>
+                <w:sz w:val="28"/>
+                <w:szCs w:val="28"/>
+                <w14:ligatures w14:val="none"/>
+              </w:rPr>
+              <w:t xml:space="preserve">MD </w:t>
+            </w:r>
+            <w:r>
+              <w:rPr>
+                <w:rFonts w:ascii="Times New Roman" w:hAnsi="Times New Roman" w:cs="Times New Roman"/>
+                <w:b/>
+                <w:bCs/>
+                <w:sz w:val="28"/>
+                <w:szCs w:val="28"/>
+              </w:rPr>
+              <w:t>Rafsan Tahlil Rifat</w:t>
+            </w:r>
           </w:p>
         </w:tc>
       </w:tr>
@@ -196,7 +229,29 @@
                 <w:szCs w:val="28"/>
                 <w14:ligatures w14:val="none"/>
               </w:rPr>
-              <w:t xml:space="preserve">Test Designed date: </w:t>
+              <w:t>Test Designed date:</w:t>
+            </w:r>
+            <w:r>
+              <w:rPr>
+                <w:rFonts w:ascii="Times New Roman" w:eastAsia="Times New Roman" w:hAnsi="Times New Roman" w:cs="Times New Roman"/>
+                <w:color w:val="000000" w:themeColor="text1"/>
+                <w:kern w:val="24"/>
+                <w:sz w:val="28"/>
+                <w:szCs w:val="28"/>
+                <w14:ligatures w14:val="none"/>
+              </w:rPr>
+              <w:t>27/04/26</w:t>
+            </w:r>
+            <w:r>
+              <w:rPr>
+                <w:rFonts w:ascii="Times New Roman" w:eastAsia="Times New Roman" w:hAnsi="Times New Roman" w:cs="Times New Roman"/>
+                <w:color w:val="000000" w:themeColor="text1"/>
+                <w:kern w:val="24"/>
+                <w:sz w:val="28"/>
+                <w:szCs w:val="28"/>
+                <w14:ligatures w14:val="none"/>
+              </w:rPr>
+              <w:t xml:space="preserve"> </w:t>
             </w:r>
           </w:p>
         </w:tc>
@@ -1041,7 +1096,26 @@
                 <w:szCs w:val="28"/>
                 <w14:ligatures w14:val="none"/>
               </w:rPr>
-              <w:t xml:space="preserve">:  </w:t>
+              <w:t xml:space="preserve">: </w:t>
+            </w:r>
+            <w:hyperlink r:id="rId9" w:tgtFrame="_blank" w:history="1">
+              <w:r>
+                <w:rPr>
+                  <w:rStyle w:val="normaltextrun"/>
+                  <w:color w:val="0000FF"/>
+                  <w:u w:val="single"/>
+                  <w:shd w:val="clear" w:color="auto" w:fill="E1E3E6"/>
+                </w:rPr>
+                <w:t>john@email.com</w:t>
+              </w:r>
+            </w:hyperlink>
+            <w:r>
+              <w:rPr>
+                <w:rStyle w:val="normaltextrun"/>
+                <w:color w:val="000000"/>
+                <w:shd w:val="clear" w:color="auto" w:fill="FFFFFF"/>
+              </w:rPr>
+              <w:t> </w:t>
             </w:r>
           </w:p>
           <w:p>
@@ -1079,6 +1153,27 @@
                 <w14:ligatures w14:val="none"/>
               </w:rPr>
               <w:t xml:space="preserve">Password: </w:t>
+            </w:r>
+            <w:r>
+              <w:rPr>
+                <w:rStyle w:val="normaltextrun"/>
+                <w:rFonts w:ascii="Times New Roman" w:hAnsi="Times New Roman" w:cs="Times New Roman"/>
+                <w:b/>
+                <w:bCs/>
+                <w:color w:val="000000"/>
+                <w:sz w:val="28"/>
+                <w:szCs w:val="28"/>
+                <w:bdr w:val="none" w:sz="0" w:space="0" w:color="auto" w:frame="1"/>
+              </w:rPr>
+              <w:t>Test1234</w:t>
+            </w:r>
+            <w:r>
+              <w:rPr>
+                <w:rStyle w:val="normaltextrun"/>
+                <w:color w:val="000000"/>
+                <w:bdr w:val="none" w:sz="0" w:space="0" w:color="auto" w:frame="1"/>
+              </w:rPr>
+              <w:t> </w:t>
             </w:r>
           </w:p>
         </w:tc>
@@ -1219,110 +1314,84 @@
                 <w:szCs w:val="28"/>
                 <w14:ligatures w14:val="none"/>
               </w:rPr>
-              <w:t xml:space="preserve">As </w:t>
-            </w:r>
-            <w:proofErr w:type="gramStart"/>
-            <w:r>
-              <w:rPr>
-                <w:rFonts w:ascii="Times New Roman" w:eastAsia="Times New Roman" w:hAnsi="Times New Roman" w:cs="Times New Roman"/>
-                <w:color w:val="000000" w:themeColor="text1"/>
-                <w:kern w:val="24"/>
-                <w:sz w:val="28"/>
-                <w:szCs w:val="28"/>
-                <w14:ligatures w14:val="none"/>
-              </w:rPr>
-              <w:t>expected</w:t>
-            </w:r>
-            <w:proofErr w:type="gramEnd"/>
-          </w:p>
-          <w:p>
-            <w:pPr>
-              <w:spacing w:before="40" w:after="40" w:line="256" w:lineRule="auto"/>
-              <w:rPr>
-                <w:rFonts w:ascii="Times New Roman" w:eastAsia="Times New Roman" w:hAnsi="Times New Roman" w:cs="Times New Roman"/>
-                <w:color w:val="000000" w:themeColor="text1"/>
-                <w:kern w:val="24"/>
-                <w:sz w:val="28"/>
-                <w:szCs w:val="28"/>
-                <w14:ligatures w14:val="none"/>
-              </w:rPr>
-            </w:pPr>
-          </w:p>
-          <w:p>
-            <w:pPr>
-              <w:spacing w:before="40" w:after="40" w:line="256" w:lineRule="auto"/>
-              <w:rPr>
-                <w:rFonts w:ascii="Times New Roman" w:eastAsia="Times New Roman" w:hAnsi="Times New Roman" w:cs="Times New Roman"/>
-                <w:color w:val="000000" w:themeColor="text1"/>
-                <w:kern w:val="24"/>
-                <w:sz w:val="28"/>
-                <w:szCs w:val="28"/>
-                <w14:ligatures w14:val="none"/>
-              </w:rPr>
-            </w:pPr>
-          </w:p>
-          <w:p>
-            <w:pPr>
-              <w:spacing w:before="40" w:after="40" w:line="256" w:lineRule="auto"/>
-              <w:rPr>
-                <w:rFonts w:ascii="Times New Roman" w:eastAsia="Times New Roman" w:hAnsi="Times New Roman" w:cs="Times New Roman"/>
-                <w:color w:val="000000" w:themeColor="text1"/>
-                <w:kern w:val="24"/>
-                <w:sz w:val="28"/>
-                <w:szCs w:val="28"/>
-                <w14:ligatures w14:val="none"/>
-              </w:rPr>
-            </w:pPr>
-          </w:p>
-          <w:p>
-            <w:pPr>
-              <w:spacing w:before="40" w:after="40" w:line="256" w:lineRule="auto"/>
-              <w:rPr>
-                <w:rFonts w:ascii="Times New Roman" w:eastAsia="Times New Roman" w:hAnsi="Times New Roman" w:cs="Times New Roman"/>
-                <w:color w:val="000000" w:themeColor="text1"/>
-                <w:kern w:val="24"/>
-                <w:sz w:val="28"/>
-                <w:szCs w:val="28"/>
-                <w14:ligatures w14:val="none"/>
-              </w:rPr>
-            </w:pPr>
-          </w:p>
-          <w:p>
-            <w:pPr>
-              <w:spacing w:before="40" w:after="40" w:line="256" w:lineRule="auto"/>
-              <w:rPr>
-                <w:rFonts w:ascii="Times New Roman" w:eastAsia="Times New Roman" w:hAnsi="Times New Roman" w:cs="Times New Roman"/>
-                <w:color w:val="000000" w:themeColor="text1"/>
-                <w:kern w:val="0"/>
-                <w:sz w:val="28"/>
-                <w:szCs w:val="28"/>
-                <w14:ligatures w14:val="none"/>
-              </w:rPr>
-            </w:pPr>
-            <w:r>
-              <w:rPr>
-                <w:rFonts w:ascii="Times New Roman" w:eastAsia="Times New Roman" w:hAnsi="Times New Roman" w:cs="Times New Roman"/>
-                <w:color w:val="000000" w:themeColor="text1"/>
-                <w:kern w:val="24"/>
-                <w:sz w:val="28"/>
-                <w:szCs w:val="28"/>
-                <w14:ligatures w14:val="none"/>
-              </w:rPr>
-              <w:t xml:space="preserve">As </w:t>
-            </w:r>
-            <w:proofErr w:type="gramStart"/>
-            <w:r>
-              <w:rPr>
-                <w:rFonts w:ascii="Times New Roman" w:eastAsia="Times New Roman" w:hAnsi="Times New Roman" w:cs="Times New Roman"/>
-                <w:color w:val="000000" w:themeColor="text1"/>
-                <w:kern w:val="24"/>
-                <w:sz w:val="28"/>
-                <w:szCs w:val="28"/>
-                <w14:ligatures w14:val="none"/>
-              </w:rPr>
-              <w:t>expected</w:t>
-            </w:r>
-            <w:proofErr w:type="gramEnd"/>
+              <w:t>As expected</w:t>
+            </w:r>
+          </w:p>
+          <w:p>
+            <w:pPr>
+              <w:spacing w:before="40" w:after="40" w:line="256" w:lineRule="auto"/>
+              <w:rPr>
+                <w:rFonts w:ascii="Times New Roman" w:eastAsia="Times New Roman" w:hAnsi="Times New Roman" w:cs="Times New Roman"/>
+                <w:color w:val="000000" w:themeColor="text1"/>
+                <w:kern w:val="24"/>
+                <w:sz w:val="28"/>
+                <w:szCs w:val="28"/>
+                <w14:ligatures w14:val="none"/>
+              </w:rPr>
+            </w:pPr>
+          </w:p>
+          <w:p>
+            <w:pPr>
+              <w:spacing w:before="40" w:after="40" w:line="256" w:lineRule="auto"/>
+              <w:rPr>
+                <w:rFonts w:ascii="Times New Roman" w:eastAsia="Times New Roman" w:hAnsi="Times New Roman" w:cs="Times New Roman"/>
+                <w:color w:val="000000" w:themeColor="text1"/>
+                <w:kern w:val="24"/>
+                <w:sz w:val="28"/>
+                <w:szCs w:val="28"/>
+                <w14:ligatures w14:val="none"/>
+              </w:rPr>
+            </w:pPr>
+          </w:p>
+          <w:p>
+            <w:pPr>
+              <w:spacing w:before="40" w:after="40" w:line="256" w:lineRule="auto"/>
+              <w:rPr>
+                <w:rFonts w:ascii="Times New Roman" w:eastAsia="Times New Roman" w:hAnsi="Times New Roman" w:cs="Times New Roman"/>
+                <w:color w:val="000000" w:themeColor="text1"/>
+                <w:kern w:val="24"/>
+                <w:sz w:val="28"/>
+                <w:szCs w:val="28"/>
+                <w14:ligatures w14:val="none"/>
+              </w:rPr>
+            </w:pPr>
+          </w:p>
+          <w:p>
+            <w:pPr>
+              <w:spacing w:before="40" w:after="40" w:line="256" w:lineRule="auto"/>
+              <w:rPr>
+                <w:rFonts w:ascii="Times New Roman" w:eastAsia="Times New Roman" w:hAnsi="Times New Roman" w:cs="Times New Roman"/>
+                <w:color w:val="000000" w:themeColor="text1"/>
+                <w:kern w:val="24"/>
+                <w:sz w:val="28"/>
+                <w:szCs w:val="28"/>
+                <w14:ligatures w14:val="none"/>
+              </w:rPr>
+            </w:pPr>
+          </w:p>
+          <w:p>
+            <w:pPr>
+              <w:spacing w:before="40" w:after="40" w:line="256" w:lineRule="auto"/>
+              <w:rPr>
+                <w:rFonts w:ascii="Times New Roman" w:eastAsia="Times New Roman" w:hAnsi="Times New Roman" w:cs="Times New Roman"/>
+                <w:color w:val="000000" w:themeColor="text1"/>
+                <w:kern w:val="0"/>
+                <w:sz w:val="28"/>
+                <w:szCs w:val="28"/>
+                <w14:ligatures w14:val="none"/>
+              </w:rPr>
+            </w:pPr>
+            <w:r>
+              <w:rPr>
+                <w:rFonts w:ascii="Times New Roman" w:eastAsia="Times New Roman" w:hAnsi="Times New Roman" w:cs="Times New Roman"/>
+                <w:color w:val="000000" w:themeColor="text1"/>
+                <w:kern w:val="24"/>
+                <w:sz w:val="28"/>
+                <w:szCs w:val="28"/>
+                <w14:ligatures w14:val="none"/>
+              </w:rPr>
+              <w:t>As expected</w:t>
+            </w:r>
           </w:p>
         </w:tc>
         <w:tc>
@@ -1526,7 +1595,67 @@
           <w:szCs w:val="36"/>
         </w:rPr>
         <w:lastRenderedPageBreak/>
-        <w:t>Test case: 02</w:t>
+        <w:t>Test case:</w:t>
+      </w:r>
+      <w:r>
+        <w:rPr>
+          <w:rFonts w:ascii="Times New Roman" w:hAnsi="Times New Roman" w:cs="Times New Roman"/>
+          <w:b/>
+          <w:bCs/>
+          <w:sz w:val="36"/>
+          <w:szCs w:val="36"/>
+        </w:rPr>
+        <w:t xml:space="preserve"> </w:t>
+      </w:r>
+      <w:r>
+        <w:rPr>
+          <w:rFonts w:ascii="Times New Roman" w:hAnsi="Times New Roman" w:cs="Times New Roman"/>
+          <w:b/>
+          <w:bCs/>
+          <w:sz w:val="36"/>
+          <w:szCs w:val="36"/>
+        </w:rPr>
+        <w:t>Verify Login</w:t>
+      </w:r>
+      <w:r>
+        <w:rPr>
+          <w:rFonts w:ascii="Times New Roman" w:hAnsi="Times New Roman" w:cs="Times New Roman"/>
+          <w:b/>
+          <w:bCs/>
+          <w:sz w:val="36"/>
+          <w:szCs w:val="36"/>
+        </w:rPr>
+        <w:t xml:space="preserve"> </w:t>
+      </w:r>
+      <w:r>
+        <w:rPr>
+          <w:rFonts w:ascii="Times New Roman" w:hAnsi="Times New Roman" w:cs="Times New Roman"/>
+          <w:b/>
+          <w:bCs/>
+          <w:sz w:val="36"/>
+          <w:szCs w:val="36"/>
+        </w:rPr>
+        <w:t>(0</w:t>
+      </w:r>
+      <w:r>
+        <w:rPr>
+          <w:rFonts w:ascii="Times New Roman" w:hAnsi="Times New Roman" w:cs="Times New Roman"/>
+          <w:b/>
+          <w:bCs/>
+          <w:sz w:val="36"/>
+          <w:szCs w:val="36"/>
+        </w:rPr>
+        <w:t>2</w:t>
+      </w:r>
+      <w:r>
+        <w:rPr>
+          <w:rFonts w:ascii="Times New Roman" w:hAnsi="Times New Roman" w:cs="Times New Roman"/>
+          <w:b/>
+          <w:bCs/>
+          <w:sz w:val="36"/>
+          <w:szCs w:val="36"/>
+        </w:rPr>
+        <w:t>)</w:t>
       </w:r>
     </w:p>
     <w:tbl>
@@ -1629,6 +1758,29 @@
               </w:rPr>
               <w:t xml:space="preserve">Test Designed by: </w:t>
             </w:r>
+            <w:r>
+              <w:rPr>
+                <w:rFonts w:ascii="Times New Roman" w:eastAsia="Times New Roman" w:hAnsi="Times New Roman" w:cs="Times New Roman"/>
+                <w:b/>
+                <w:bCs/>
+                <w:color w:val="000000" w:themeColor="text1"/>
+                <w:kern w:val="24"/>
+                <w:sz w:val="28"/>
+                <w:szCs w:val="28"/>
+                <w14:ligatures w14:val="none"/>
+              </w:rPr>
+              <w:t xml:space="preserve">MD </w:t>
+            </w:r>
+            <w:r>
+              <w:rPr>
+                <w:rFonts w:ascii="Times New Roman" w:hAnsi="Times New Roman" w:cs="Times New Roman"/>
+                <w:b/>
+                <w:bCs/>
+                <w:sz w:val="28"/>
+                <w:szCs w:val="28"/>
+              </w:rPr>
+              <w:t>Rafsan Tahlil Rifat</w:t>
+            </w:r>
           </w:p>
         </w:tc>
       </w:tr>
@@ -1712,6 +1864,17 @@
               </w:rPr>
               <w:t xml:space="preserve">Test Designed date: </w:t>
             </w:r>
+            <w:r>
+              <w:rPr>
+                <w:rFonts w:ascii="Times New Roman" w:eastAsia="Times New Roman" w:hAnsi="Times New Roman" w:cs="Times New Roman"/>
+                <w:color w:val="000000" w:themeColor="text1"/>
+                <w:kern w:val="24"/>
+                <w:sz w:val="28"/>
+                <w:szCs w:val="28"/>
+                <w14:ligatures w14:val="none"/>
+              </w:rPr>
+              <w:t>27/04/2026</w:t>
+            </w:r>
           </w:p>
         </w:tc>
       </w:tr>
@@ -1949,33 +2112,7 @@
                 <w:szCs w:val="28"/>
                 <w14:ligatures w14:val="none"/>
               </w:rPr>
-              <w:t xml:space="preserve">Verify login with valid email and </w:t>
-            </w:r>
-            <w:r>
-              <w:rPr>
-                <w:rFonts w:ascii="Times New Roman" w:eastAsia="Times New Roman" w:hAnsi="Times New Roman" w:cs="Times New Roman"/>
-                <w:b/>
-                <w:bCs/>
-                <w:color w:val="000000" w:themeColor="text1"/>
-                <w:kern w:val="24"/>
-                <w:sz w:val="28"/>
-                <w:szCs w:val="28"/>
-                <w14:ligatures w14:val="none"/>
-              </w:rPr>
-              <w:t xml:space="preserve">incorrect </w:t>
-            </w:r>
-            <w:r>
-              <w:rPr>
-                <w:rFonts w:ascii="Times New Roman" w:eastAsia="Times New Roman" w:hAnsi="Times New Roman" w:cs="Times New Roman"/>
-                <w:b/>
-                <w:bCs/>
-                <w:color w:val="000000" w:themeColor="text1"/>
-                <w:kern w:val="24"/>
-                <w:sz w:val="28"/>
-                <w:szCs w:val="28"/>
-                <w14:ligatures w14:val="none"/>
-              </w:rPr>
-              <w:t>password</w:t>
+              <w:t>Verify login with valid email and incorrect password</w:t>
             </w:r>
           </w:p>
         </w:tc>
@@ -2053,29 +2190,7 @@
                 <w:szCs w:val="28"/>
                 <w14:ligatures w14:val="none"/>
               </w:rPr>
-              <w:t xml:space="preserve">functionality with </w:t>
-            </w:r>
-            <w:r>
-              <w:rPr>
-                <w:rFonts w:ascii="Times New Roman" w:eastAsia="Times New Roman" w:hAnsi="Times New Roman" w:cs="Times New Roman"/>
-                <w:color w:val="000000" w:themeColor="text1"/>
-                <w:kern w:val="24"/>
-                <w:sz w:val="28"/>
-                <w:szCs w:val="28"/>
-                <w14:ligatures w14:val="none"/>
-              </w:rPr>
-              <w:t>in</w:t>
-            </w:r>
-            <w:r>
-              <w:rPr>
-                <w:rFonts w:ascii="Times New Roman" w:eastAsia="Times New Roman" w:hAnsi="Times New Roman" w:cs="Times New Roman"/>
-                <w:color w:val="000000" w:themeColor="text1"/>
-                <w:kern w:val="24"/>
-                <w:sz w:val="28"/>
-                <w:szCs w:val="28"/>
-                <w14:ligatures w14:val="none"/>
-              </w:rPr>
-              <w:t>correct password</w:t>
+              <w:t>functionality with incorrect password</w:t>
             </w:r>
           </w:p>
         </w:tc>
@@ -2504,18 +2619,7 @@
                 <w:szCs w:val="28"/>
                 <w14:ligatures w14:val="none"/>
               </w:rPr>
-              <w:t>incorrect</w:t>
-            </w:r>
-            <w:r>
-              <w:rPr>
-                <w:rFonts w:ascii="Times New Roman" w:eastAsia="Times New Roman" w:hAnsi="Times New Roman" w:cs="Times New Roman"/>
-                <w:color w:val="000000" w:themeColor="text1"/>
-                <w:kern w:val="24"/>
-                <w:sz w:val="28"/>
-                <w:szCs w:val="28"/>
-                <w14:ligatures w14:val="none"/>
-              </w:rPr>
-              <w:t xml:space="preserve"> </w:t>
+              <w:t xml:space="preserve">incorrect </w:t>
             </w:r>
             <w:r>
               <w:rPr>
@@ -2647,27 +2751,59 @@
                 <w:szCs w:val="28"/>
                 <w14:ligatures w14:val="none"/>
               </w:rPr>
-              <w:t xml:space="preserve">:  </w:t>
-            </w:r>
-          </w:p>
-          <w:p>
-            <w:pPr>
-              <w:spacing w:before="40" w:after="40" w:line="256" w:lineRule="auto"/>
-              <w:rPr>
-                <w:rFonts w:ascii="Times New Roman" w:eastAsia="Times New Roman" w:hAnsi="Times New Roman" w:cs="Times New Roman"/>
-                <w:color w:val="000000" w:themeColor="text1"/>
-                <w:kern w:val="24"/>
-                <w:sz w:val="28"/>
-                <w:szCs w:val="28"/>
-                <w14:ligatures w14:val="none"/>
-              </w:rPr>
-            </w:pPr>
-          </w:p>
-          <w:p>
-            <w:pPr>
-              <w:spacing w:before="40" w:after="40" w:line="256" w:lineRule="auto"/>
-              <w:rPr>
-                <w:rFonts w:ascii="Times New Roman" w:eastAsia="Times New Roman" w:hAnsi="Times New Roman" w:cs="Times New Roman"/>
+              <w:t xml:space="preserve">: </w:t>
+            </w:r>
+            <w:hyperlink r:id="rId10" w:tgtFrame="_blank" w:history="1">
+              <w:r>
+                <w:rPr>
+                  <w:rStyle w:val="normaltextrun"/>
+                  <w:color w:val="0000FF"/>
+                  <w:u w:val="single"/>
+                  <w:shd w:val="clear" w:color="auto" w:fill="E1E3E6"/>
+                </w:rPr>
+                <w:t>john@email.com</w:t>
+              </w:r>
+            </w:hyperlink>
+            <w:r>
+              <w:rPr>
+                <w:rStyle w:val="normaltextrun"/>
+                <w:color w:val="000000"/>
+                <w:shd w:val="clear" w:color="auto" w:fill="FFFFFF"/>
+              </w:rPr>
+              <w:t> </w:t>
+            </w:r>
+            <w:r>
+              <w:rPr>
+                <w:rFonts w:ascii="Times New Roman" w:eastAsia="Times New Roman" w:hAnsi="Times New Roman" w:cs="Times New Roman"/>
+                <w:color w:val="000000" w:themeColor="text1"/>
+                <w:kern w:val="24"/>
+                <w:sz w:val="28"/>
+                <w:szCs w:val="28"/>
+                <w14:ligatures w14:val="none"/>
+              </w:rPr>
+              <w:t xml:space="preserve"> </w:t>
+            </w:r>
+          </w:p>
+          <w:p>
+            <w:pPr>
+              <w:spacing w:before="40" w:after="40" w:line="256" w:lineRule="auto"/>
+              <w:rPr>
+                <w:rFonts w:ascii="Times New Roman" w:eastAsia="Times New Roman" w:hAnsi="Times New Roman" w:cs="Times New Roman"/>
+                <w:color w:val="000000" w:themeColor="text1"/>
+                <w:kern w:val="24"/>
+                <w:sz w:val="28"/>
+                <w:szCs w:val="28"/>
+                <w14:ligatures w14:val="none"/>
+              </w:rPr>
+            </w:pPr>
+          </w:p>
+          <w:p>
+            <w:pPr>
+              <w:spacing w:before="40" w:after="40" w:line="256" w:lineRule="auto"/>
+              <w:rPr>
+                <w:rFonts w:ascii="Times New Roman" w:eastAsia="Times New Roman" w:hAnsi="Times New Roman" w:cs="Times New Roman"/>
+                <w:b/>
+                <w:bCs/>
                 <w:color w:val="000000" w:themeColor="text1"/>
                 <w:kern w:val="0"/>
                 <w:sz w:val="28"/>
@@ -2685,6 +2821,19 @@
                 <w14:ligatures w14:val="none"/>
               </w:rPr>
               <w:t xml:space="preserve">Password: </w:t>
+            </w:r>
+            <w:r>
+              <w:rPr>
+                <w:rFonts w:ascii="Times New Roman" w:eastAsia="Times New Roman" w:hAnsi="Times New Roman" w:cs="Times New Roman"/>
+                <w:b/>
+                <w:bCs/>
+                <w:color w:val="000000" w:themeColor="text1"/>
+                <w:kern w:val="24"/>
+                <w:sz w:val="28"/>
+                <w:szCs w:val="28"/>
+                <w14:ligatures w14:val="none"/>
+              </w:rPr>
+              <w:t>test123</w:t>
             </w:r>
           </w:p>
         </w:tc>
@@ -2843,110 +2992,84 @@
                 <w:szCs w:val="28"/>
                 <w14:ligatures w14:val="none"/>
               </w:rPr>
-              <w:t xml:space="preserve"> </w:t>
-            </w:r>
-            <w:proofErr w:type="gramStart"/>
-            <w:r>
-              <w:rPr>
-                <w:rFonts w:ascii="Times New Roman" w:eastAsia="Times New Roman" w:hAnsi="Times New Roman" w:cs="Times New Roman"/>
-                <w:color w:val="000000" w:themeColor="text1"/>
-                <w:kern w:val="24"/>
-                <w:sz w:val="28"/>
-                <w:szCs w:val="28"/>
-                <w14:ligatures w14:val="none"/>
-              </w:rPr>
-              <w:t>expected</w:t>
-            </w:r>
-            <w:proofErr w:type="gramEnd"/>
-          </w:p>
-          <w:p>
-            <w:pPr>
-              <w:spacing w:before="40" w:after="40" w:line="256" w:lineRule="auto"/>
-              <w:rPr>
-                <w:rFonts w:ascii="Times New Roman" w:eastAsia="Times New Roman" w:hAnsi="Times New Roman" w:cs="Times New Roman"/>
-                <w:color w:val="000000" w:themeColor="text1"/>
-                <w:kern w:val="24"/>
-                <w:sz w:val="28"/>
-                <w:szCs w:val="28"/>
-                <w14:ligatures w14:val="none"/>
-              </w:rPr>
-            </w:pPr>
-          </w:p>
-          <w:p>
-            <w:pPr>
-              <w:spacing w:before="40" w:after="40" w:line="256" w:lineRule="auto"/>
-              <w:rPr>
-                <w:rFonts w:ascii="Times New Roman" w:eastAsia="Times New Roman" w:hAnsi="Times New Roman" w:cs="Times New Roman"/>
-                <w:color w:val="000000" w:themeColor="text1"/>
-                <w:kern w:val="24"/>
-                <w:sz w:val="28"/>
-                <w:szCs w:val="28"/>
-                <w14:ligatures w14:val="none"/>
-              </w:rPr>
-            </w:pPr>
-          </w:p>
-          <w:p>
-            <w:pPr>
-              <w:spacing w:before="40" w:after="40" w:line="256" w:lineRule="auto"/>
-              <w:rPr>
-                <w:rFonts w:ascii="Times New Roman" w:eastAsia="Times New Roman" w:hAnsi="Times New Roman" w:cs="Times New Roman"/>
-                <w:color w:val="000000" w:themeColor="text1"/>
-                <w:kern w:val="24"/>
-                <w:sz w:val="28"/>
-                <w:szCs w:val="28"/>
-                <w14:ligatures w14:val="none"/>
-              </w:rPr>
-            </w:pPr>
-          </w:p>
-          <w:p>
-            <w:pPr>
-              <w:spacing w:before="40" w:after="40" w:line="256" w:lineRule="auto"/>
-              <w:rPr>
-                <w:rFonts w:ascii="Times New Roman" w:eastAsia="Times New Roman" w:hAnsi="Times New Roman" w:cs="Times New Roman"/>
-                <w:color w:val="000000" w:themeColor="text1"/>
-                <w:kern w:val="24"/>
-                <w:sz w:val="28"/>
-                <w:szCs w:val="28"/>
-                <w14:ligatures w14:val="none"/>
-              </w:rPr>
-            </w:pPr>
-          </w:p>
-          <w:p>
-            <w:pPr>
-              <w:spacing w:before="40" w:after="40" w:line="256" w:lineRule="auto"/>
-              <w:rPr>
-                <w:rFonts w:ascii="Times New Roman" w:eastAsia="Times New Roman" w:hAnsi="Times New Roman" w:cs="Times New Roman"/>
-                <w:color w:val="000000" w:themeColor="text1"/>
-                <w:kern w:val="0"/>
-                <w:sz w:val="28"/>
-                <w:szCs w:val="28"/>
-                <w14:ligatures w14:val="none"/>
-              </w:rPr>
-            </w:pPr>
-            <w:r>
-              <w:rPr>
-                <w:rFonts w:ascii="Times New Roman" w:eastAsia="Times New Roman" w:hAnsi="Times New Roman" w:cs="Times New Roman"/>
-                <w:color w:val="000000" w:themeColor="text1"/>
-                <w:kern w:val="24"/>
-                <w:sz w:val="28"/>
-                <w:szCs w:val="28"/>
-                <w14:ligatures w14:val="none"/>
-              </w:rPr>
-              <w:t xml:space="preserve">As </w:t>
-            </w:r>
-            <w:proofErr w:type="gramStart"/>
-            <w:r>
-              <w:rPr>
-                <w:rFonts w:ascii="Times New Roman" w:eastAsia="Times New Roman" w:hAnsi="Times New Roman" w:cs="Times New Roman"/>
-                <w:color w:val="000000" w:themeColor="text1"/>
-                <w:kern w:val="24"/>
-                <w:sz w:val="28"/>
-                <w:szCs w:val="28"/>
-                <w14:ligatures w14:val="none"/>
-              </w:rPr>
-              <w:t>expected</w:t>
-            </w:r>
-            <w:proofErr w:type="gramEnd"/>
+              <w:t xml:space="preserve"> expected</w:t>
+            </w:r>
+          </w:p>
+          <w:p>
+            <w:pPr>
+              <w:spacing w:before="40" w:after="40" w:line="256" w:lineRule="auto"/>
+              <w:rPr>
+                <w:rFonts w:ascii="Times New Roman" w:eastAsia="Times New Roman" w:hAnsi="Times New Roman" w:cs="Times New Roman"/>
+                <w:color w:val="000000" w:themeColor="text1"/>
+                <w:kern w:val="24"/>
+                <w:sz w:val="28"/>
+                <w:szCs w:val="28"/>
+                <w14:ligatures w14:val="none"/>
+              </w:rPr>
+            </w:pPr>
+          </w:p>
+          <w:p>
+            <w:pPr>
+              <w:spacing w:before="40" w:after="40" w:line="256" w:lineRule="auto"/>
+              <w:rPr>
+                <w:rFonts w:ascii="Times New Roman" w:eastAsia="Times New Roman" w:hAnsi="Times New Roman" w:cs="Times New Roman"/>
+                <w:color w:val="000000" w:themeColor="text1"/>
+                <w:kern w:val="24"/>
+                <w:sz w:val="28"/>
+                <w:szCs w:val="28"/>
+                <w14:ligatures w14:val="none"/>
+              </w:rPr>
+            </w:pPr>
+          </w:p>
+          <w:p>
+            <w:pPr>
+              <w:spacing w:before="40" w:after="40" w:line="256" w:lineRule="auto"/>
+              <w:rPr>
+                <w:rFonts w:ascii="Times New Roman" w:eastAsia="Times New Roman" w:hAnsi="Times New Roman" w:cs="Times New Roman"/>
+                <w:color w:val="000000" w:themeColor="text1"/>
+                <w:kern w:val="24"/>
+                <w:sz w:val="28"/>
+                <w:szCs w:val="28"/>
+                <w14:ligatures w14:val="none"/>
+              </w:rPr>
+            </w:pPr>
+          </w:p>
+          <w:p>
+            <w:pPr>
+              <w:spacing w:before="40" w:after="40" w:line="256" w:lineRule="auto"/>
+              <w:rPr>
+                <w:rFonts w:ascii="Times New Roman" w:eastAsia="Times New Roman" w:hAnsi="Times New Roman" w:cs="Times New Roman"/>
+                <w:color w:val="000000" w:themeColor="text1"/>
+                <w:kern w:val="24"/>
+                <w:sz w:val="28"/>
+                <w:szCs w:val="28"/>
+                <w14:ligatures w14:val="none"/>
+              </w:rPr>
+            </w:pPr>
+          </w:p>
+          <w:p>
+            <w:pPr>
+              <w:spacing w:before="40" w:after="40" w:line="256" w:lineRule="auto"/>
+              <w:rPr>
+                <w:rFonts w:ascii="Times New Roman" w:eastAsia="Times New Roman" w:hAnsi="Times New Roman" w:cs="Times New Roman"/>
+                <w:color w:val="000000" w:themeColor="text1"/>
+                <w:kern w:val="0"/>
+                <w:sz w:val="28"/>
+                <w:szCs w:val="28"/>
+                <w14:ligatures w14:val="none"/>
+              </w:rPr>
+            </w:pPr>
+            <w:r>
+              <w:rPr>
+                <w:rFonts w:ascii="Times New Roman" w:eastAsia="Times New Roman" w:hAnsi="Times New Roman" w:cs="Times New Roman"/>
+                <w:color w:val="000000" w:themeColor="text1"/>
+                <w:kern w:val="24"/>
+                <w:sz w:val="28"/>
+                <w:szCs w:val="28"/>
+                <w14:ligatures w14:val="none"/>
+              </w:rPr>
+              <w:t>As expected</w:t>
+            </w:r>
           </w:p>
         </w:tc>
         <w:tc>
@@ -4723,6 +4846,11 @@
       </w:tblBorders>
     </w:tblPr>
   </w:style>
+  <w:style w:type="character" w:customStyle="1" w:styleId="normaltextrun">
+    <w:name w:val="normaltextrun"/>
+    <w:basedOn w:val="DefaultParagraphFont"/>
+    <w:rsid w:val="00A73986"/>
+  </w:style>
 </w:styles>
 </file>
 
@@ -5022,12 +5150,7 @@
 </file>
 
 <file path=customXml/item1.xml><?xml version="1.0" encoding="utf-8"?>
-<?mso-contentType ?>
-<FormTemplates xmlns="http://schemas.microsoft.com/sharepoint/v3/contenttype/forms">
-  <Display>DocumentLibraryForm</Display>
-  <Edit>DocumentLibraryForm</Edit>
-  <New>DocumentLibraryForm</New>
-</FormTemplates>
+<b:Sources xmlns:b="http://schemas.openxmlformats.org/officeDocument/2006/bibliography" xmlns="http://schemas.openxmlformats.org/officeDocument/2006/bibliography" SelectedStyle="\APASixthEditionOfficeOnline.xsl" StyleName="APA" Version="6"/>
 </file>
 
 <file path=customXml/item2.xml><?xml version="1.0" encoding="utf-8"?>
@@ -5220,7 +5343,12 @@
 </file>
 
 <file path=customXml/item3.xml><?xml version="1.0" encoding="utf-8"?>
-<b:Sources xmlns:b="http://schemas.openxmlformats.org/officeDocument/2006/bibliography" xmlns="http://schemas.openxmlformats.org/officeDocument/2006/bibliography" SelectedStyle="\APASixthEditionOfficeOnline.xsl" StyleName="APA" Version="6"/>
+<?mso-contentType ?>
+<FormTemplates xmlns="http://schemas.microsoft.com/sharepoint/v3/contenttype/forms">
+  <Display>DocumentLibraryForm</Display>
+  <Edit>DocumentLibraryForm</Edit>
+  <New>DocumentLibraryForm</New>
+</FormTemplates>
 </file>
 
 <file path=customXml/item4.xml><?xml version="1.0" encoding="utf-8"?>
@@ -5235,9 +5363,9 @@
 </file>
 
 <file path=customXml/itemProps1.xml><?xml version="1.0" encoding="utf-8"?>
-<ds:datastoreItem xmlns:ds="http://schemas.openxmlformats.org/officeDocument/2006/customXml" ds:itemID="{5E8E9F63-8B86-4E88-9C5D-F31A19A9DF0F}">
+<ds:datastoreItem xmlns:ds="http://schemas.openxmlformats.org/officeDocument/2006/customXml" ds:itemID="{556DAA7C-9E7E-448D-B68F-765A9F42D781}">
   <ds:schemaRefs>
-    <ds:schemaRef ds:uri="http://schemas.microsoft.com/sharepoint/v3/contenttype/forms"/>
+    <ds:schemaRef ds:uri="http://schemas.openxmlformats.org/officeDocument/2006/bibliography"/>
   </ds:schemaRefs>
 </ds:datastoreItem>
 </file>
@@ -5262,9 +5390,9 @@
 </file>
 
 <file path=customXml/itemProps3.xml><?xml version="1.0" encoding="utf-8"?>
-<ds:datastoreItem xmlns:ds="http://schemas.openxmlformats.org/officeDocument/2006/customXml" ds:itemID="{556DAA7C-9E7E-448D-B68F-765A9F42D781}">
+<ds:datastoreItem xmlns:ds="http://schemas.openxmlformats.org/officeDocument/2006/customXml" ds:itemID="{5E8E9F63-8B86-4E88-9C5D-F31A19A9DF0F}">
   <ds:schemaRefs>
-    <ds:schemaRef ds:uri="http://schemas.openxmlformats.org/officeDocument/2006/bibliography"/>
+    <ds:schemaRef ds:uri="http://schemas.microsoft.com/sharepoint/v3/contenttype/forms"/>
   </ds:schemaRefs>
 </ds:datastoreItem>
 </file>

</xml_diff>